<commit_message>
Close remaining Hogan Methods comments without inventing HA coefficients.
Cite Goggins 2017 for humidity only in Model 2, treat five-day versus three-day official counts as a rescaling of Model 1, drop the leftover Acknowledgements WIP footnote, and lock the PDF comment map to the flattened H1–H21 / KW7–KW20 wording.

Co-authored-by: Shen Ruililin <bobshenruililin@users.noreply.github.com>
</commit_message>
<xml_diff>
--- a/manuscript/live_collaborative/Heat_CVD_Methods_20260824_paste.docx
+++ b/manuscript/live_collaborative/Heat_CVD_Methods_20260824_paste.docx
@@ -134,7 +134,7 @@
           <w:i w:val="0"/>
           <w:sz w:val="24"/>
         </w:rPr>
-        <w:t>The monthly weather list includes total rainfall and official extreme-day counts. In the analysis file, rainfall is the monthly total in millimetres, and hot nights, very hot days, extremely hot days, and cold days are day counts. We analysed monthly mean temperature, monthly mean daily maximum temperature, monthly mean daily minimum temperature, and the official counts of hot nights, very hot days, and cold days. We divided the three official counts by 5 so that each estimate is the change in monthly hospital counts associated with five extra such days in that month, rather than with one extra day. Fine particulate matter (PM2.5) from general EPD stations was assembled and is not in Model 1. A station-month entered a pollutant mean only when at least 75% of expected readings were present. Missing readings were not coded as zero. Territory-wide monthly pollutant values are unweighted means of eligible general stations. Roadside monitors were not used. Nitrogen dioxide and PM2.5 were specified to enter pollution checks before ozone, because ozone often rises on hot, sunny days. We did not use extra heatwave-spell rules beyond the official daily thresholds.</w:t>
+        <w:t>The monthly weather list includes total rainfall and official extreme-day counts. In the analysis file, rainfall is the monthly total in millimetres, and hot nights, very hot days, extremely hot days, and cold days are day counts. We analysed monthly mean temperature, monthly mean daily maximum temperature, monthly mean daily minimum temperature, and the official counts of hot nights, very hot days, and cold days. We divided the three official counts by 5 so that each estimate is the change in monthly hospital counts associated with five extra such days in that month, rather than with one extra day. Five days is a convenient scale, not a new weather threshold. A station-month entered a pollutant mean only when at least 75% of expected readings were present. Missing readings were not coded as zero. Territory-wide monthly pollutant values are unweighted means of eligible general stations. Roadside monitors were not used. Nitrogen dioxide and PM2.5 were specified to enter pollution checks before ozone, because ozone often rises on hot, sunny days. We did not use extra heatwave-spell rules beyond the official daily thresholds.</w:t>
       </w:r>
     </w:p>
     <w:p>
@@ -284,7 +284,7 @@
           <w:i w:val="0"/>
           <w:sz w:val="24"/>
         </w:rPr>
-        <w:t>Model 2 adds monthly total rainfall and monthly mean relative humidity to Model 1. Table 2 reports Model 1.</w:t>
+        <w:t>Model 2 adds monthly total rainfall and monthly mean relative humidity to Model 1. Goggins and Chan included humidity among meteorological predictors of daily heart-failure admissions in Hong Kong [21]. Table 2 reports Model 1.</w:t>
       </w:r>
     </w:p>
     <w:p>
@@ -329,7 +329,7 @@
           <w:i w:val="0"/>
           <w:sz w:val="24"/>
         </w:rPr>
-        <w:t>Official day-count estimates from Model 1 can also be read per 3 days or per 1 day by rescaling the five-day coefficients. Cold-day models restricted to November–March are a labelled sensitivity. Other checks were: a smoother time curve (3, 6, or 8 degrees of freedom); year indicators instead of the time curve; dropping the first 12 or 24 months; using only January 2013–December 2019 (84 months); adding COVID-period indicators; lagging the weather variable by 0, 1, or 2 months; and dropping the month with the largest Cook’s distance. COVID periods were: through January 2020; February 2020–December 2021; January–April 2022; May–December 2022; and from January 2023. We inspected residual correlation at lags 6 and 12. We computed Benjamini–Hochberg *q*-values across the twelve Model 1 fits [20]. Models that added pollution or influenza are extra checks. They are not replacements for Model 1.</w:t>
+        <w:t>Official day-count estimates from Model 1 can also be read per 3 days or per 1 day without fitting a new model. If the count ratio per five days is *R*, the count ratio per three days is *R*^(3/5) and the count ratio per one day is *R*^(1/5). Those are the same coefficient on a different scale. Cold-day models restricted to November–March are a labelled sensitivity. Other checks were: a smoother time curve (3, 6, or 8 degrees of freedom); year indicators instead of the time curve; dropping the first 12 or 24 months; using only January 2013–December 2019 (84 months); adding COVID-period indicators; lagging the weather variable by 0, 1, or 2 months; and dropping the month with the largest Cook’s distance. COVID periods were: through January 2020; February 2020–December 2021; January–April 2022; May–December 2022; and from January 2023. We inspected residual correlation at lags 6 and 12. We computed Benjamini–Hochberg *q*-values across the twelve Model 1 fits [20]. Models that added pollution or influenza are extra checks. They are not replacements for Model 1.</w:t>
       </w:r>
     </w:p>
     <w:p>

</xml_diff>